<commit_message>
Add marketplace onboarding UX, policy audit, and preserve Hostinger .env on deploy.
Fix /sell crash, require Terms/Privacy acceptance with saved records, shop CS phones and logo map markers, admin create/preapprove/invite flows with RBAC, and exclude api/database from frontend rsync --delete.

Co-authored-by: Cursor <cursoragent@cursor.com>
</commit_message>
<xml_diff>
--- a/docs/legal/00_DPM_Legal_Where_To_Fill_Your_Details.docx
+++ b/docs/legal/00_DPM_Legal_Where_To_Fill_Your_Details.docx
@@ -2,64 +2,6 @@
 <file path=word/document.xml><?xml version="1.0" encoding="utf-8"?>
 <w:document xmlns:wpc="http://schemas.microsoft.com/office/word/2010/wordprocessingCanvas" xmlns:mo="http://schemas.microsoft.com/office/mac/office/2008/main" xmlns:mc="http://schemas.openxmlformats.org/markup-compatibility/2006" xmlns:mv="urn:schemas-microsoft-com:mac:vml" xmlns:o="urn:schemas-microsoft-com:office:office" xmlns:r="http://schemas.openxmlformats.org/officeDocument/2006/relationships" xmlns:m="http://schemas.openxmlformats.org/officeDocument/2006/math" xmlns:v="urn:schemas-microsoft-com:vml" xmlns:wp14="http://schemas.microsoft.com/office/word/2010/wordprocessingDrawing" xmlns:wp="http://schemas.openxmlformats.org/drawingml/2006/wordprocessingDrawing" xmlns:w10="urn:schemas-microsoft-com:office:word" xmlns:w="http://schemas.openxmlformats.org/wordprocessingml/2006/main" xmlns:w14="http://schemas.microsoft.com/office/word/2010/wordml" xmlns:wpg="http://schemas.microsoft.com/office/word/2010/wordprocessingGroup" xmlns:wpi="http://schemas.microsoft.com/office/word/2010/wordprocessingInk" xmlns:wne="http://schemas.microsoft.com/office/word/2006/wordml" xmlns:wps="http://schemas.microsoft.com/office/word/2010/wordprocessingShape" mc:Ignorable="w14 wp14">
   <w:body>
-    <w:tbl>
-      <w:tblPr>
-        <w:tblStyle w:val="TableGrid"/>
-        <w:tblW w:type="auto" w:w="0"/>
-        <w:tblLook w:firstColumn="1" w:firstRow="1" w:lastColumn="0" w:lastRow="0" w:noHBand="0" w:noVBand="1" w:val="04A0"/>
-      </w:tblPr>
-      <w:tblGrid>
-        <w:gridCol w:w="8640"/>
-      </w:tblGrid>
-      <w:tr>
-        <w:tc>
-          <w:tcPr>
-            <w:tcW w:type="dxa" w:w="8640"/>
-            <w:shd w:fill="FFF8E1"/>
-          </w:tcPr>
-          <w:p>
-            <w:pPr>
-              <w:jc w:val="center"/>
-            </w:pPr>
-            <w:r>
-              <w:rPr>
-                <w:b/>
-                <w:color w:val="B86E00"/>
-              </w:rPr>
-              <w:t>◆ INSERT: LOGO HERE (optional, top of policy) ◆</w:t>
-            </w:r>
-          </w:p>
-          <w:p>
-            <w:pPr>
-              <w:jc w:val="center"/>
-            </w:pPr>
-            <w:r>
-              <w:rPr>
-                <w:i/>
-                <w:color w:val="555555"/>
-                <w:sz w:val="18"/>
-              </w:rPr>
-              <w:t>Insert → Pictures</w:t>
-            </w:r>
-          </w:p>
-        </w:tc>
-      </w:tr>
-    </w:tbl>
-    <w:p/>
-    <w:p>
-      <w:pPr>
-        <w:jc w:val="center"/>
-      </w:pPr>
-      <w:r>
-        <w:rPr>
-          <w:b/>
-          <w:color w:val="B86E00"/>
-          <w:sz w:val="32"/>
-        </w:rPr>
-        <w:t>[COMPANY LEGAL NAME]</w:t>
-      </w:r>
-    </w:p>
-    <w:p/>
     <w:p>
       <w:pPr>
         <w:pStyle w:val="Heading1"/>
@@ -68,44 +10,16 @@
         <w:rPr>
           <w:color w:val="1B5E20"/>
         </w:rPr>
-        <w:t>Legal Policies — Where To Fill Your Details</w:t>
+        <w:t>DanyPathMart Legal Policies — Guide</w:t>
       </w:r>
     </w:p>
     <w:p>
       <w:r>
         <w:rPr>
-          <w:b/>
+          <w:i w:val="0"/>
+          <w:sz w:val="22"/>
         </w:rPr>
-        <w:t xml:space="preserve">Effective date: </w:t>
-      </w:r>
-      <w:r>
-        <w:t>[EFFECTIVE DATE]</w:t>
-      </w:r>
-      <w:r>
-        <w:t xml:space="preserve">  ·  Last updated: </w:t>
-      </w:r>
-      <w:r>
-        <w:t>[LAST UPDATED DATE]</w:t>
-      </w:r>
-      <w:r>
-        <w:t xml:space="preserve">  ·  Website slug for admin CMS: </w:t>
-      </w:r>
-      <w:r>
-        <w:rPr>
-          <w:i/>
-        </w:rPr>
-        <w:t>—</w:t>
-      </w:r>
-    </w:p>
-    <w:p/>
-    <w:p>
-      <w:r>
-        <w:rPr>
-          <w:i/>
-          <w:color w:val="555555"/>
-          <w:sz w:val="18"/>
-        </w:rPr>
-        <w:t>DRAFT — NOT LEGAL ADVICE. Have a qualified Ghana lawyer review before publishing. Replace all [BRACKETED] placeholders, then paste into Admin → Legal policies or publish as PDF on your site.</w:t>
+        <w:t>Source markdown: docs/legal/policies/*.md  ·  Website: https://danypathmart.store  ·  Regenerate Word files: python docs/legal/generate_legal_docs.py</w:t>
       </w:r>
     </w:p>
     <w:p/>
@@ -114,7 +28,25 @@
         <w:pStyle w:val="Heading2"/>
       </w:pPr>
       <w:r>
-        <w:t>Documents in this folder</w:t>
+        <w:t>Operating status</w:t>
+      </w:r>
+    </w:p>
+    <w:p>
+      <w:r>
+        <w:rPr>
+          <w:i w:val="0"/>
+          <w:sz w:val="22"/>
+        </w:rPr>
+        <w:t>DanyPathMart is currently operated as an online marketplace and is not yet formally registered with Ghanaian authorities. When you complete registration, update the markdown policies and regenerate these Word files.</w:t>
+      </w:r>
+    </w:p>
+    <w:p/>
+    <w:p>
+      <w:pPr>
+        <w:pStyle w:val="Heading2"/>
+      </w:pPr>
+      <w:r>
+        <w:t>Word files in this folder</w:t>
       </w:r>
     </w:p>
     <w:tbl>
@@ -124,41 +56,53 @@
         <w:tblLook w:firstColumn="1" w:firstRow="1" w:lastColumn="0" w:lastRow="0" w:noHBand="0" w:noVBand="1" w:val="04A0"/>
       </w:tblPr>
       <w:tblGrid>
-        <w:gridCol w:w="2880"/>
-        <w:gridCol w:w="2880"/>
-        <w:gridCol w:w="2880"/>
+        <w:gridCol w:w="2160"/>
+        <w:gridCol w:w="2160"/>
+        <w:gridCol w:w="2160"/>
+        <w:gridCol w:w="2160"/>
       </w:tblGrid>
       <w:tr>
         <w:tc>
           <w:tcPr>
-            <w:tcW w:type="dxa" w:w="2880"/>
+            <w:tcW w:type="dxa" w:w="2160"/>
             <w:shd w:fill="E8F5E9"/>
           </w:tcPr>
           <w:p>
             <w:r>
-              <w:t>File</w:t>
+              <w:t>Word file</w:t>
             </w:r>
           </w:p>
         </w:tc>
         <w:tc>
           <w:tcPr>
-            <w:tcW w:type="dxa" w:w="2880"/>
+            <w:tcW w:type="dxa" w:w="2160"/>
             <w:shd w:fill="E8F5E9"/>
           </w:tcPr>
           <w:p>
             <w:r>
-              <w:t>Suggested CMS slug</w:t>
+              <w:t>Markdown source</w:t>
             </w:r>
           </w:p>
         </w:tc>
         <w:tc>
           <w:tcPr>
-            <w:tcW w:type="dxa" w:w="2880"/>
+            <w:tcW w:type="dxa" w:w="2160"/>
             <w:shd w:fill="E8F5E9"/>
           </w:tcPr>
           <w:p>
             <w:r>
-              <w:t>Audience</w:t>
+              <w:t>CMS slug</w:t>
+            </w:r>
+          </w:p>
+        </w:tc>
+        <w:tc>
+          <w:tcPr>
+            <w:tcW w:type="dxa" w:w="2160"/>
+            <w:shd w:fill="E8F5E9"/>
+          </w:tcPr>
+          <w:p>
+            <w:r>
+              <w:t>Footer</w:t>
             </w:r>
           </w:p>
         </w:tc>
@@ -166,7 +110,7 @@
       <w:tr>
         <w:tc>
           <w:tcPr>
-            <w:tcW w:type="dxa" w:w="2880"/>
+            <w:tcW w:type="dxa" w:w="2160"/>
           </w:tcPr>
           <w:p>
             <w:r>
@@ -176,7 +120,17 @@
         </w:tc>
         <w:tc>
           <w:tcPr>
-            <w:tcW w:type="dxa" w:w="2880"/>
+            <w:tcW w:type="dxa" w:w="2160"/>
+          </w:tcPr>
+          <w:p>
+            <w:r>
+              <w:t>policies/terms.md</w:t>
+            </w:r>
+          </w:p>
+        </w:tc>
+        <w:tc>
+          <w:tcPr>
+            <w:tcW w:type="dxa" w:w="2160"/>
           </w:tcPr>
           <w:p>
             <w:r>
@@ -186,11 +140,11 @@
         </w:tc>
         <w:tc>
           <w:tcPr>
-            <w:tcW w:type="dxa" w:w="2880"/>
+            <w:tcW w:type="dxa" w:w="2160"/>
           </w:tcPr>
           <w:p>
             <w:r>
-              <w:t>All customers using the site</w:t>
+              <w:t>Yes</w:t>
             </w:r>
           </w:p>
         </w:tc>
@@ -198,7 +152,7 @@
       <w:tr>
         <w:tc>
           <w:tcPr>
-            <w:tcW w:type="dxa" w:w="2880"/>
+            <w:tcW w:type="dxa" w:w="2160"/>
           </w:tcPr>
           <w:p>
             <w:r>
@@ -208,7 +162,17 @@
         </w:tc>
         <w:tc>
           <w:tcPr>
-            <w:tcW w:type="dxa" w:w="2880"/>
+            <w:tcW w:type="dxa" w:w="2160"/>
+          </w:tcPr>
+          <w:p>
+            <w:r>
+              <w:t>policies/privacy.md</w:t>
+            </w:r>
+          </w:p>
+        </w:tc>
+        <w:tc>
+          <w:tcPr>
+            <w:tcW w:type="dxa" w:w="2160"/>
           </w:tcPr>
           <w:p>
             <w:r>
@@ -218,11 +182,11 @@
         </w:tc>
         <w:tc>
           <w:tcPr>
-            <w:tcW w:type="dxa" w:w="2880"/>
+            <w:tcW w:type="dxa" w:w="2160"/>
           </w:tcPr>
           <w:p>
             <w:r>
-              <w:t>Data collection &amp; DPC compliance</w:t>
+              <w:t>Yes</w:t>
             </w:r>
           </w:p>
         </w:tc>
@@ -230,7 +194,7 @@
       <w:tr>
         <w:tc>
           <w:tcPr>
-            <w:tcW w:type="dxa" w:w="2880"/>
+            <w:tcW w:type="dxa" w:w="2160"/>
           </w:tcPr>
           <w:p>
             <w:r>
@@ -240,7 +204,17 @@
         </w:tc>
         <w:tc>
           <w:tcPr>
-            <w:tcW w:type="dxa" w:w="2880"/>
+            <w:tcW w:type="dxa" w:w="2160"/>
+          </w:tcPr>
+          <w:p>
+            <w:r>
+              <w:t>policies/cookies.md</w:t>
+            </w:r>
+          </w:p>
+        </w:tc>
+        <w:tc>
+          <w:tcPr>
+            <w:tcW w:type="dxa" w:w="2160"/>
           </w:tcPr>
           <w:p>
             <w:r>
@@ -250,11 +224,11 @@
         </w:tc>
         <w:tc>
           <w:tcPr>
-            <w:tcW w:type="dxa" w:w="2880"/>
+            <w:tcW w:type="dxa" w:w="2160"/>
           </w:tcPr>
           <w:p>
             <w:r>
-              <w:t>Cookies &amp; similar technologies</w:t>
+              <w:t>Yes</w:t>
             </w:r>
           </w:p>
         </w:tc>
@@ -262,7 +236,7 @@
       <w:tr>
         <w:tc>
           <w:tcPr>
-            <w:tcW w:type="dxa" w:w="2880"/>
+            <w:tcW w:type="dxa" w:w="2160"/>
           </w:tcPr>
           <w:p>
             <w:r>
@@ -272,21 +246,31 @@
         </w:tc>
         <w:tc>
           <w:tcPr>
-            <w:tcW w:type="dxa" w:w="2880"/>
+            <w:tcW w:type="dxa" w:w="2160"/>
           </w:tcPr>
           <w:p>
             <w:r>
-              <w:t>shop-policy</w:t>
+              <w:t>policies/shop-seller-policy.md</w:t>
             </w:r>
           </w:p>
         </w:tc>
         <w:tc>
           <w:tcPr>
-            <w:tcW w:type="dxa" w:w="2880"/>
+            <w:tcW w:type="dxa" w:w="2160"/>
           </w:tcPr>
           <w:p>
             <w:r>
-              <w:t>Marketplace sellers / shops</w:t>
+              <w:t>shop-seller-policy</w:t>
+            </w:r>
+          </w:p>
+        </w:tc>
+        <w:tc>
+          <w:tcPr>
+            <w:tcW w:type="dxa" w:w="2160"/>
+          </w:tcPr>
+          <w:p>
+            <w:r>
+              <w:t>Yes</w:t>
             </w:r>
           </w:p>
         </w:tc>
@@ -294,7 +278,7 @@
       <w:tr>
         <w:tc>
           <w:tcPr>
-            <w:tcW w:type="dxa" w:w="2880"/>
+            <w:tcW w:type="dxa" w:w="2160"/>
           </w:tcPr>
           <w:p>
             <w:r>
@@ -304,7 +288,17 @@
         </w:tc>
         <w:tc>
           <w:tcPr>
-            <w:tcW w:type="dxa" w:w="2880"/>
+            <w:tcW w:type="dxa" w:w="2160"/>
+          </w:tcPr>
+          <w:p>
+            <w:r>
+              <w:t>policies/payments.md</w:t>
+            </w:r>
+          </w:p>
+        </w:tc>
+        <w:tc>
+          <w:tcPr>
+            <w:tcW w:type="dxa" w:w="2160"/>
           </w:tcPr>
           <w:p>
             <w:r>
@@ -314,11 +308,11 @@
         </w:tc>
         <w:tc>
           <w:tcPr>
-            <w:tcW w:type="dxa" w:w="2880"/>
+            <w:tcW w:type="dxa" w:w="2160"/>
           </w:tcPr>
           <w:p>
             <w:r>
-              <w:t>Paystack, fees, billing</w:t>
+              <w:t>Yes</w:t>
             </w:r>
           </w:p>
         </w:tc>
@@ -326,7 +320,7 @@
       <w:tr>
         <w:tc>
           <w:tcPr>
-            <w:tcW w:type="dxa" w:w="2880"/>
+            <w:tcW w:type="dxa" w:w="2160"/>
           </w:tcPr>
           <w:p>
             <w:r>
@@ -336,7 +330,17 @@
         </w:tc>
         <w:tc>
           <w:tcPr>
-            <w:tcW w:type="dxa" w:w="2880"/>
+            <w:tcW w:type="dxa" w:w="2160"/>
+          </w:tcPr>
+          <w:p>
+            <w:r>
+              <w:t>policies/returns.md</w:t>
+            </w:r>
+          </w:p>
+        </w:tc>
+        <w:tc>
+          <w:tcPr>
+            <w:tcW w:type="dxa" w:w="2160"/>
           </w:tcPr>
           <w:p>
             <w:r>
@@ -346,11 +350,11 @@
         </w:tc>
         <w:tc>
           <w:tcPr>
-            <w:tcW w:type="dxa" w:w="2880"/>
+            <w:tcW w:type="dxa" w:w="2160"/>
           </w:tcPr>
           <w:p>
             <w:r>
-              <w:t>Returns &amp; refunds (existing slug)</w:t>
+              <w:t>Yes</w:t>
             </w:r>
           </w:p>
         </w:tc>
@@ -358,7 +362,7 @@
       <w:tr>
         <w:tc>
           <w:tcPr>
-            <w:tcW w:type="dxa" w:w="2880"/>
+            <w:tcW w:type="dxa" w:w="2160"/>
           </w:tcPr>
           <w:p>
             <w:r>
@@ -368,7 +372,17 @@
         </w:tc>
         <w:tc>
           <w:tcPr>
-            <w:tcW w:type="dxa" w:w="2880"/>
+            <w:tcW w:type="dxa" w:w="2160"/>
+          </w:tcPr>
+          <w:p>
+            <w:r>
+              <w:t>policies/acceptable-use.md</w:t>
+            </w:r>
+          </w:p>
+        </w:tc>
+        <w:tc>
+          <w:tcPr>
+            <w:tcW w:type="dxa" w:w="2160"/>
           </w:tcPr>
           <w:p>
             <w:r>
@@ -378,11 +392,11 @@
         </w:tc>
         <w:tc>
           <w:tcPr>
-            <w:tcW w:type="dxa" w:w="2880"/>
+            <w:tcW w:type="dxa" w:w="2160"/>
           </w:tcPr>
           <w:p>
             <w:r>
-              <w:t>Prohibited conduct</w:t>
+              <w:t>Yes</w:t>
             </w:r>
           </w:p>
         </w:tc>
@@ -390,7 +404,7 @@
       <w:tr>
         <w:tc>
           <w:tcPr>
-            <w:tcW w:type="dxa" w:w="2880"/>
+            <w:tcW w:type="dxa" w:w="2160"/>
           </w:tcPr>
           <w:p>
             <w:r>
@@ -400,21 +414,73 @@
         </w:tc>
         <w:tc>
           <w:tcPr>
-            <w:tcW w:type="dxa" w:w="2880"/>
+            <w:tcW w:type="dxa" w:w="2160"/>
           </w:tcPr>
           <w:p>
             <w:r>
-              <w:t>complaints</w:t>
+              <w:t>policies/complaints-disputes.md</w:t>
             </w:r>
           </w:p>
         </w:tc>
         <w:tc>
           <w:tcPr>
-            <w:tcW w:type="dxa" w:w="2880"/>
+            <w:tcW w:type="dxa" w:w="2160"/>
           </w:tcPr>
           <w:p>
             <w:r>
-              <w:t>How to complain / disputes</w:t>
+              <w:t>complaints-disputes</w:t>
+            </w:r>
+          </w:p>
+        </w:tc>
+        <w:tc>
+          <w:tcPr>
+            <w:tcW w:type="dxa" w:w="2160"/>
+          </w:tcPr>
+          <w:p>
+            <w:r>
+              <w:t>Yes</w:t>
+            </w:r>
+          </w:p>
+        </w:tc>
+      </w:tr>
+      <w:tr>
+        <w:tc>
+          <w:tcPr>
+            <w:tcW w:type="dxa" w:w="2160"/>
+          </w:tcPr>
+          <w:p>
+            <w:r>
+              <w:t>09_Seller_Handbook.docx</w:t>
+            </w:r>
+          </w:p>
+        </w:tc>
+        <w:tc>
+          <w:tcPr>
+            <w:tcW w:type="dxa" w:w="2160"/>
+          </w:tcPr>
+          <w:p>
+            <w:r>
+              <w:t>policies/seller-handbook.md</w:t>
+            </w:r>
+          </w:p>
+        </w:tc>
+        <w:tc>
+          <w:tcPr>
+            <w:tcW w:type="dxa" w:w="2160"/>
+          </w:tcPr>
+          <w:p>
+            <w:r>
+              <w:t>seller-handbook</w:t>
+            </w:r>
+          </w:p>
+        </w:tc>
+        <w:tc>
+          <w:tcPr>
+            <w:tcW w:type="dxa" w:w="2160"/>
+          </w:tcPr>
+          <w:p>
+            <w:r>
+              <w:t>No</w:t>
             </w:r>
           </w:p>
         </w:tc>
@@ -426,119 +492,7 @@
         <w:pStyle w:val="Heading2"/>
       </w:pPr>
       <w:r>
-        <w:t>Placeholders to fill in every document</w:t>
-      </w:r>
-    </w:p>
-    <w:p>
-      <w:pPr>
-        <w:pStyle w:val="ListBullet"/>
-      </w:pPr>
-      <w:r>
-        <w:t>[COMPANY LEGAL NAME] — exact name on RGD certificate</w:t>
-      </w:r>
-    </w:p>
-    <w:p>
-      <w:pPr>
-        <w:pStyle w:val="ListBullet"/>
-      </w:pPr>
-      <w:r>
-        <w:t>[TRADING NAME / BRAND NAME] — e.g. DanyPathMart</w:t>
-      </w:r>
-    </w:p>
-    <w:p>
-      <w:pPr>
-        <w:pStyle w:val="ListBullet"/>
-      </w:pPr>
-      <w:r>
-        <w:t>[RGD COMPANY NUMBER] — from Registrar General</w:t>
-      </w:r>
-    </w:p>
-    <w:p>
-      <w:pPr>
-        <w:pStyle w:val="ListBullet"/>
-      </w:pPr>
-      <w:r>
-        <w:t>[TIN] — Ghana Revenue Authority tax ID (if shown)</w:t>
-      </w:r>
-    </w:p>
-    <w:p>
-      <w:pPr>
-        <w:pStyle w:val="ListBullet"/>
-      </w:pPr>
-      <w:r>
-        <w:t>[REGISTERED OFFICE ADDRESS] — physical / registered address</w:t>
-      </w:r>
-    </w:p>
-    <w:p>
-      <w:pPr>
-        <w:pStyle w:val="ListBullet"/>
-      </w:pPr>
-      <w:r>
-        <w:t>[SUPPORT EMAIL], [SUPPORT PHONE], [WHATSAPP SUPPORT]</w:t>
-      </w:r>
-    </w:p>
-    <w:p>
-      <w:pPr>
-        <w:pStyle w:val="ListBullet"/>
-      </w:pPr>
-      <w:r>
-        <w:t>[YOUR WEBSITE URL] — e.g. https://danypathmart.store</w:t>
-      </w:r>
-    </w:p>
-    <w:p>
-      <w:pPr>
-        <w:pStyle w:val="ListBullet"/>
-      </w:pPr>
-      <w:r>
-        <w:t>[EFFECTIVE DATE] / [LAST UPDATED DATE]</w:t>
-      </w:r>
-    </w:p>
-    <w:p>
-      <w:pPr>
-        <w:pStyle w:val="ListBullet"/>
-      </w:pPr>
-      <w:r>
-        <w:t>[STANDARD REGISTRATION FEE], [RENEWAL FEE AND PERIOD]</w:t>
-      </w:r>
-    </w:p>
-    <w:p>
-      <w:pPr>
-        <w:pStyle w:val="ListBullet"/>
-      </w:pPr>
-      <w:r>
-        <w:t>[RETURNS WINDOW DAYS] — e.g. 7</w:t>
-      </w:r>
-    </w:p>
-    <w:p>
-      <w:pPr>
-        <w:pStyle w:val="ListBullet"/>
-      </w:pPr>
-      <w:r>
-        <w:t>[DATA PROTECTION OFFICER EMAIL] — for privacy requests</w:t>
-      </w:r>
-    </w:p>
-    <w:p>
-      <w:pPr>
-        <w:pStyle w:val="ListBullet"/>
-      </w:pPr>
-      <w:r>
-        <w:t>[PAYSTACK BUSINESS NAME] — as shown on checkout</w:t>
-      </w:r>
-    </w:p>
-    <w:p>
-      <w:pPr>
-        <w:pStyle w:val="ListBullet"/>
-      </w:pPr>
-      <w:r>
-        <w:t>[GOVERNING LAW] — typically "Republic of Ghana"</w:t>
-      </w:r>
-    </w:p>
-    <w:p>
-      <w:pPr>
-        <w:pStyle w:val="Heading2"/>
-      </w:pPr>
-      <w:r>
-        <w:t>Publishing on DanyPathMart</w:t>
+        <w:t>Publish to the live site</w:t>
       </w:r>
     </w:p>
     <w:p>
@@ -546,7 +500,7 @@
         <w:pStyle w:val="ListNumber"/>
       </w:pPr>
       <w:r>
-        <w:t>Fill placeholders in each Word file; optional lawyer review.</w:t>
+        <w:t>Edit the .md file in docs/legal/policies/ (or use these Word files for sharing).</w:t>
       </w:r>
     </w:p>
     <w:p>
@@ -554,7 +508,7 @@
         <w:pStyle w:val="ListNumber"/>
       </w:pPr>
       <w:r>
-        <w:t>Admin → Legal policies → create or edit each policy using the suggested slug.</w:t>
+        <w:t>Run: cd backend &amp;&amp; php scripts/seed-legal-policies.php</w:t>
       </w:r>
     </w:p>
     <w:p>
@@ -562,31 +516,7 @@
         <w:pStyle w:val="ListNumber"/>
       </w:pPr>
       <w:r>
-        <w:t>Set Published = yes and Show in footer where appropriate.</w:t>
-      </w:r>
-    </w:p>
-    <w:p>
-      <w:pPr>
-        <w:pStyle w:val="ListNumber"/>
-      </w:pPr>
-      <w:r>
-        <w:t>Terms &amp; Privacy: show in footer. Cookies: footer or link from Privacy.</w:t>
-      </w:r>
-    </w:p>
-    <w:p>
-      <w:pPr>
-        <w:pStyle w:val="ListNumber"/>
-      </w:pPr>
-      <w:r>
-        <w:t>Shop policy: link from shop apply page and seller dashboard.</w:t>
-      </w:r>
-    </w:p>
-    <w:p>
-      <w:pPr>
-        <w:pStyle w:val="ListNumber"/>
-      </w:pPr>
-      <w:r>
-        <w:t>Payment policy: link at checkout and shop billing pages.</w:t>
+        <w:t>Verify at https://danypathmart.store/policies/{slug}</w:t>
       </w:r>
     </w:p>
     <w:sectPr>

</xml_diff>